<commit_message>
Final changes on Task 1
</commit_message>
<xml_diff>
--- a/Task_1/Task1 Checklist - Daniel Reyes.docx
+++ b/Task_1/Task1 Checklist - Daniel Reyes.docx
@@ -73,7 +73,23 @@
           <w:rFonts w:ascii="Roboto" w:hAnsi="Roboto"/>
           <w:color w:val="202124"/>
         </w:rPr>
-        <w:t>The Sentinel-2 data contain 13 UINT16 spectral bands representing TOA reflectance scaled by 10000. See the </w:t>
+        <w:t xml:space="preserve">The Sentinel-2 data </w:t>
+      </w:r>
+      <w:proofErr w:type="gramStart"/>
+      <w:r>
+        <w:rPr>
+          <w:rFonts w:ascii="Roboto" w:hAnsi="Roboto"/>
+          <w:color w:val="202124"/>
+        </w:rPr>
+        <w:t>contain</w:t>
+      </w:r>
+      <w:proofErr w:type="gramEnd"/>
+      <w:r>
+        <w:rPr>
+          <w:rFonts w:ascii="Roboto" w:hAnsi="Roboto"/>
+          <w:color w:val="202124"/>
+        </w:rPr>
+        <w:t xml:space="preserve"> 13 UINT16 spectral bands representing TOA reflectance scaled by 10000. See the </w:t>
       </w:r>
       <w:hyperlink r:id="rId5" w:history="1">
         <w:r>
@@ -107,7 +123,7 @@
           <w:color w:val="202124"/>
         </w:rPr>
       </w:pPr>
-      <w:hyperlink r:id="rId6" w:history="1">
+      <w:hyperlink r:id="rId6" w:anchor="colab-python" w:history="1">
         <w:r>
           <w:rPr>
             <w:rStyle w:val="Hyperlink"/>
@@ -133,7 +149,23 @@
           <w:rFonts w:ascii="Roboto" w:hAnsi="Roboto"/>
           <w:color w:val="202124"/>
         </w:rPr>
-        <w:t xml:space="preserve">Sentinel-2 imagery has multiple bands in order to capture </w:t>
+        <w:t xml:space="preserve">Sentinel-2 imagery has multiple bands </w:t>
+      </w:r>
+      <w:proofErr w:type="gramStart"/>
+      <w:r>
+        <w:rPr>
+          <w:rFonts w:ascii="Roboto" w:hAnsi="Roboto"/>
+          <w:color w:val="202124"/>
+        </w:rPr>
+        <w:t>in order to</w:t>
+      </w:r>
+      <w:proofErr w:type="gramEnd"/>
+      <w:r>
+        <w:rPr>
+          <w:rFonts w:ascii="Roboto" w:hAnsi="Roboto"/>
+          <w:color w:val="202124"/>
+        </w:rPr>
+        <w:t xml:space="preserve"> capture </w:t>
       </w:r>
       <w:r>
         <w:rPr>
@@ -257,7 +289,23 @@
         <w:t xml:space="preserve">Near Infrared Reflectance, </w:t>
       </w:r>
       <w:r>
-        <w:t>and Red refers to the Red band reflectance. Both of these bands are provided by Sentinel-2</w:t>
+        <w:t xml:space="preserve">and Red refers to the </w:t>
+      </w:r>
+      <w:proofErr w:type="gramStart"/>
+      <w:r>
+        <w:t>Red</w:t>
+      </w:r>
+      <w:proofErr w:type="gramEnd"/>
+      <w:r>
+        <w:t xml:space="preserve"> band reflectance. </w:t>
+      </w:r>
+      <w:proofErr w:type="gramStart"/>
+      <w:r>
+        <w:t>Both of these</w:t>
+      </w:r>
+      <w:proofErr w:type="gramEnd"/>
+      <w:r>
+        <w:t xml:space="preserve"> bands are provided by Sentinel-2</w:t>
       </w:r>
       <w:r>
         <w:t xml:space="preserve">. </w:t>
@@ -267,7 +315,23 @@
           <w:b/>
           <w:bCs/>
         </w:rPr>
-        <w:t>Healthy vegetation absorbs red light, and strongly reflects near infrared.</w:t>
+        <w:t xml:space="preserve">Healthy vegetation absorbs red </w:t>
+      </w:r>
+      <w:proofErr w:type="gramStart"/>
+      <w:r>
+        <w:rPr>
+          <w:b/>
+          <w:bCs/>
+        </w:rPr>
+        <w:t>light, and</w:t>
+      </w:r>
+      <w:proofErr w:type="gramEnd"/>
+      <w:r>
+        <w:rPr>
+          <w:b/>
+          <w:bCs/>
+        </w:rPr>
+        <w:t xml:space="preserve"> strongly reflects near infrared.</w:t>
       </w:r>
     </w:p>
     <w:p>
@@ -608,7 +672,21 @@
         <w:rPr>
           <w:lang w:val="en-US"/>
         </w:rPr>
-        <w:t>: the Processing Baseline number (e.g. N0204)</w:t>
+        <w:t xml:space="preserve">: </w:t>
+      </w:r>
+      <w:proofErr w:type="gramStart"/>
+      <w:r>
+        <w:rPr>
+          <w:lang w:val="en-US"/>
+        </w:rPr>
+        <w:t>the</w:t>
+      </w:r>
+      <w:proofErr w:type="gramEnd"/>
+      <w:r>
+        <w:rPr>
+          <w:lang w:val="en-US"/>
+        </w:rPr>
+        <w:t xml:space="preserve"> Processing Baseline number (e.g. N0204)</w:t>
       </w:r>
     </w:p>
     <w:p>
@@ -829,7 +907,15 @@
         <w:spacing w:after="240"/>
       </w:pPr>
       <w:r>
-        <w:t>What problems might missing labels or noisy data introduce in training?</w:t>
+        <w:t xml:space="preserve">What problems might </w:t>
+      </w:r>
+      <w:proofErr w:type="gramStart"/>
+      <w:r>
+        <w:t>missing</w:t>
+      </w:r>
+      <w:proofErr w:type="gramEnd"/>
+      <w:r>
+        <w:t xml:space="preserve"> labels or noisy data introduce in training?</w:t>
       </w:r>
     </w:p>
     <w:p>
@@ -981,9 +1067,17 @@
         <w:rPr>
           <w:lang w:val="en-US"/>
         </w:rPr>
-        <w:t>)/(</w:t>
+        <w:t>)</w:t>
+      </w:r>
+      <w:proofErr w:type="gramStart"/>
+      <w:r>
+        <w:rPr>
+          <w:lang w:val="en-US"/>
+        </w:rPr>
+        <w:t>/(</w:t>
       </w:r>
       <w:proofErr w:type="spellStart"/>
+      <w:proofErr w:type="gramEnd"/>
       <w:r>
         <w:rPr>
           <w:lang w:val="en-US"/>
@@ -1098,7 +1192,15 @@
         <w:ind w:left="720"/>
       </w:pPr>
       <w:r>
-        <w:t>Categorical labels must be converted to numbers because ML models operate on mathematical operations, son categorical data should be converted before the model can process it.</w:t>
+        <w:t xml:space="preserve">Categorical labels must be converted to numbers because ML models operate on mathematical operations, </w:t>
+      </w:r>
+      <w:proofErr w:type="gramStart"/>
+      <w:r>
+        <w:t>son</w:t>
+      </w:r>
+      <w:proofErr w:type="gramEnd"/>
+      <w:r>
+        <w:t xml:space="preserve"> categorical data should be converted before the model can process it.</w:t>
       </w:r>
     </w:p>
     <w:p>
@@ -1181,28 +1283,7 @@
         <w:ind w:left="720"/>
       </w:pPr>
       <w:r>
-        <w:t xml:space="preserve">Features are the input variables </w:t>
-      </w:r>
-      <w:r>
-        <w:t>we</w:t>
-      </w:r>
-      <w:r>
-        <w:t xml:space="preserve"> use to make predictions. They describe the characteristics or properties of </w:t>
-      </w:r>
-      <w:r>
-        <w:t>our</w:t>
-      </w:r>
-      <w:r>
-        <w:t xml:space="preserve"> data points.</w:t>
-      </w:r>
-      <w:r>
-        <w:t xml:space="preserve"> </w:t>
-      </w:r>
-      <w:r>
-        <w:t>Labels, on the other hand, are the outputs or target values you want the model to predict.</w:t>
-      </w:r>
-      <w:r>
-        <w:t xml:space="preserve"> </w:t>
+        <w:t xml:space="preserve">Features are the input variables we use to make predictions. They describe the characteristics or properties of our data points. Labels, on the other hand, are the outputs or target values you want the model to predict. </w:t>
       </w:r>
       <w:hyperlink r:id="rId11" w:history="1">
         <w:r>
@@ -1235,10 +1316,7 @@
         <w:ind w:left="720"/>
       </w:pPr>
       <w:r>
-        <w:t>Proper management of datasets plays a crucial role in optimizing the model’s performance, measuring its generalization ability, and preventing undesirable situations like overfitting.</w:t>
-      </w:r>
-      <w:r>
-        <w:t xml:space="preserve"> Training sets are used during the “learning” process of the </w:t>
+        <w:t xml:space="preserve">Proper management of datasets plays a crucial role in optimizing the model’s performance, measuring its generalization ability, and preventing undesirable situations like overfitting. Training sets are used during the “learning” process of the </w:t>
       </w:r>
       <w:r>
         <w:t>model,</w:t>
@@ -1247,13 +1325,7 @@
         <w:t xml:space="preserve"> and they allow the model to understand patterns and relationships necessary for a specific task or problem. Validation sets are essential to evaluate the model’s performa</w:t>
       </w:r>
       <w:r>
-        <w:t>nce and optimize hyperparameters (</w:t>
-      </w:r>
-      <w:r>
-        <w:t>settings that determine the model’s training process and structure and are usually adjusted manually through trial and error</w:t>
-      </w:r>
-      <w:r>
-        <w:t>). Test sets demonstrate how well the model would perform in real-world scenario</w:t>
+        <w:t>nce and optimize hyperparameters (settings that determine the model’s training process and structure and are usually adjusted manually through trial and error). Test sets demonstrate how well the model would perform in real-world scenario</w:t>
       </w:r>
       <w:r>
         <w:t>s, containing data that the model has never seen before.</w:t>
@@ -1269,16 +1341,7 @@
         <w:ind w:left="720"/>
       </w:pPr>
       <w:r>
-        <w:t>Generally</w:t>
-      </w:r>
-      <w:r>
-        <w:t>, datasets are typically divided into 70% training, 20% test, and 10% validation sets</w:t>
-      </w:r>
-      <w:r>
-        <w:t xml:space="preserve">. </w:t>
-      </w:r>
-      <w:r>
-        <w:t>However, these ratios can vary depending on the size of the dataset, the complexity of the problem, and the characteristics of the model being used.</w:t>
+        <w:t>Generally, datasets are typically divided into 70% training, 20% test, and 10% validation sets. However, these ratios can vary depending on the size of the dataset, the complexity of the problem, and the characteristics of the model being used.</w:t>
       </w:r>
     </w:p>
     <w:p>
@@ -1340,43 +1403,7 @@
           <w:rPr>
             <w:rStyle w:val="Hyperlink"/>
           </w:rPr>
-          <w:t>https://www.coursera.org/artic</w:t>
-        </w:r>
-        <w:r>
-          <w:rPr>
-            <w:rStyle w:val="Hyperlink"/>
-          </w:rPr>
-          <w:t>l</w:t>
-        </w:r>
-        <w:r>
-          <w:rPr>
-            <w:rStyle w:val="Hyperlink"/>
-          </w:rPr>
-          <w:t>es/classification-vs</w:t>
-        </w:r>
-        <w:r>
-          <w:rPr>
-            <w:rStyle w:val="Hyperlink"/>
-          </w:rPr>
-          <w:t>-</w:t>
-        </w:r>
-        <w:r>
-          <w:rPr>
-            <w:rStyle w:val="Hyperlink"/>
-          </w:rPr>
-          <w:t>regres</w:t>
-        </w:r>
-        <w:r>
-          <w:rPr>
-            <w:rStyle w:val="Hyperlink"/>
-          </w:rPr>
-          <w:t>s</w:t>
-        </w:r>
-        <w:r>
-          <w:rPr>
-            <w:rStyle w:val="Hyperlink"/>
-          </w:rPr>
-          <w:t>ion-machine-learning</w:t>
+          <w:t>https://www.coursera.org/articles/classification-vs-regression-machine-learning</w:t>
         </w:r>
       </w:hyperlink>
     </w:p>
@@ -1401,7 +1428,15 @@
         <w:ind w:left="720"/>
       </w:pPr>
       <w:r>
-        <w:t>Training aims to create a model that successfully distinguishes the positive class from the negative class. For this reason, batches need a sufficient number of both positive and negative classes.</w:t>
+        <w:t xml:space="preserve">Training aims to create a model that successfully distinguishes the positive class from the negative class. For this reason, batches need </w:t>
+      </w:r>
+      <w:proofErr w:type="gramStart"/>
+      <w:r>
+        <w:t>a sufficient number</w:t>
+      </w:r>
+      <w:proofErr w:type="gramEnd"/>
+      <w:r>
+        <w:t xml:space="preserve"> of both positive and negative classes.</w:t>
       </w:r>
       <w:r>
         <w:t xml:space="preserve"> </w:t>
@@ -1410,17 +1445,14 @@
         <w:t xml:space="preserve">An imbalanced dataset is one where the number of instances in one class (majority class) significantly outweighs those in another (minority class). </w:t>
       </w:r>
       <w:r>
-        <w:t xml:space="preserve">Models trained on imbalance tend to be biased toward the majority class. </w:t>
-      </w:r>
-      <w:r>
-        <w:t>A model might achieve 99% accuracy by simply predicting the majority class for every instance in a 99:1 split, but it would be completely ineffective at identifying the rare, but often more important, minority class. </w:t>
-      </w:r>
-    </w:p>
-    <w:p>
-      <w:pPr>
-        <w:ind w:left="720"/>
-      </w:pPr>
-      <w:hyperlink r:id="rId14" w:history="1">
+        <w:t>Models trained on imbalance tend to be biased toward the majority class. A model might achieve 99% accuracy by simply predicting the majority class for every instance in a 99:1 split, but it would be completely ineffective at identifying the rare, but often more important, minority class. </w:t>
+      </w:r>
+    </w:p>
+    <w:p>
+      <w:pPr>
+        <w:ind w:left="720"/>
+      </w:pPr>
+      <w:hyperlink r:id="rId14" w:anchor=":~:text=Page%20Summary,and%20upweighting%20the%20majority%20class" w:history="1">
         <w:r>
           <w:rPr>
             <w:rStyle w:val="Hyperlink"/>
@@ -1483,7 +1515,7 @@
       <w:pPr>
         <w:ind w:left="720"/>
       </w:pPr>
-      <w:hyperlink r:id="rId16" w:history="1">
+      <w:hyperlink r:id="rId16" w:anchor=":~:text=Train%20vs.,predictions%20can%20uncover%20obvious%20issues" w:history="1">
         <w:r>
           <w:rPr>
             <w:rStyle w:val="Hyperlink"/>
@@ -1492,10 +1524,7 @@
         </w:r>
       </w:hyperlink>
       <w:r>
-        <w:t>.</w:t>
-      </w:r>
-      <w:r>
-        <w:t xml:space="preserve"> </w:t>
+        <w:t xml:space="preserve">. </w:t>
       </w:r>
     </w:p>
     <w:p>
@@ -1530,10 +1559,7 @@
         <w:t xml:space="preserve"> apply in different situation</w:t>
       </w:r>
       <w:r>
-        <w:t xml:space="preserve">s. </w:t>
-      </w:r>
-      <w:r>
-        <w:t>Because high-resolution images contain a massive amount of pixel data and detail, complex models can easily become too specialized to the training set, leading to poor performance on new, unseen data. </w:t>
+        <w:t>s. Because high-resolution images contain a massive amount of pixel data and detail, complex models can easily become too specialized to the training set, leading to poor performance on new, unseen data. </w:t>
       </w:r>
     </w:p>
     <w:p>
@@ -1541,7 +1567,7 @@
         <w:spacing w:after="240"/>
         <w:ind w:left="720"/>
       </w:pPr>
-      <w:hyperlink r:id="rId17" w:history="1">
+      <w:hyperlink r:id="rId17" w:anchor=":~:text=Overfitting%20happens%20when%20a%20model%20is%20too%20complex%2C%20making%20it,that%20apply%20in%20different%20situations" w:history="1">
         <w:r>
           <w:rPr>
             <w:rStyle w:val="Hyperlink"/>
@@ -3126,6 +3152,7 @@
   <w:style w:type="character" w:default="1" w:styleId="DefaultParagraphFont">
     <w:name w:val="Default Paragraph Font"/>
     <w:uiPriority w:val="1"/>
+    <w:semiHidden/>
     <w:unhideWhenUsed/>
   </w:style>
   <w:style w:type="table" w:default="1" w:styleId="TableNormal">

</xml_diff>